<commit_message>
alinneacion con el cv a data engineer v2
</commit_message>
<xml_diff>
--- a/output/docx/Ramiro_Godino_CV_Data_Engineer.docx
+++ b/output/docx/Ramiro_Godino_CV_Data_Engineer.docx
@@ -60,40 +60,92 @@
           <w:lang w:val="es-AR"/>
         </w:rPr>
       </w:pPr>
-      <w:r>
-        <w:rPr>
+      <w:proofErr w:type="gramStart"/>
+      <w:proofErr w:type="gramEnd"/>
+      <w:r>
+        <w:rPr>
+          <w:rFonts w:ascii="Arial" w:hAnsi="Arial"/>
           <w:color w:val="5B677A"/>
           <w:sz w:val="17"/>
-          <w:lang w:val="es-AR"/>
-        </w:rPr>
-        <w:t>Vicente L</w:t>
-      </w:r>
-      <w:r>
-        <w:rPr>
+        </w:rPr>
+        <w:t xml:space="preserve">Vicente L?pez, Buenos Aires, Argentina | </w:t>
+      </w:r>
+      <w:hyperlink r:id="rId8">
+        <w:r>
+          <w:rPr>
+            <w:rStyle w:val="Hyperlink"/>
+            <w:color w:val="2563EB"/>
+            <w:u w:val="single"/>
+            <w:rFonts w:ascii="Arial" w:hAnsi="Arial"/>
+            <w:sz w:val="17"/>
+            <w:szCs w:val="17"/>
+          </w:rPr>
+          <w:t>ramisoaresgache@hotmail.com</w:t>
+        </w:r>
+      </w:hyperlink>
+      <w:r>
+        <w:rPr>
+          <w:rFonts w:ascii="Arial" w:hAnsi="Arial"/>
           <w:color w:val="5B677A"/>
           <w:sz w:val="17"/>
-          <w:lang w:val="es-AR"/>
-        </w:rPr>
-        <w:t>ó</w:t>
-      </w:r>
-      <w:r>
-        <w:rPr>
+        </w:rPr>
+        <w:t xml:space="preserve"> | </w:t>
+      </w:r>
+      <w:hyperlink r:id="rId9">
+        <w:r>
+          <w:rPr>
+            <w:rStyle w:val="Hyperlink"/>
+            <w:color w:val="2563EB"/>
+            <w:u w:val="single"/>
+            <w:rFonts w:ascii="Arial" w:hAnsi="Arial"/>
+            <w:sz w:val="17"/>
+            <w:szCs w:val="17"/>
+          </w:rPr>
+          <w:t>LinkedIn</w:t>
+        </w:r>
+      </w:hyperlink>
+      <w:r>
+        <w:rPr>
+          <w:rFonts w:ascii="Arial" w:hAnsi="Arial"/>
           <w:color w:val="5B677A"/>
           <w:sz w:val="17"/>
-          <w:lang w:val="es-AR"/>
-        </w:rPr>
-        <w:t xml:space="preserve">pez, Buenos Aires, Argentina | ramisoaresgache@hotmail.com | LinkedIn | GitHub | </w:t>
-      </w:r>
-      <w:proofErr w:type="gramStart"/>
-      <w:r>
-        <w:rPr>
+        </w:rPr>
+        <w:t xml:space="preserve"> | </w:t>
+      </w:r>
+      <w:hyperlink r:id="rId10">
+        <w:r>
+          <w:rPr>
+            <w:rStyle w:val="Hyperlink"/>
+            <w:color w:val="2563EB"/>
+            <w:u w:val="single"/>
+            <w:rFonts w:ascii="Arial" w:hAnsi="Arial"/>
+            <w:sz w:val="17"/>
+            <w:szCs w:val="17"/>
+          </w:rPr>
+          <w:t>GitHub</w:t>
+        </w:r>
+      </w:hyperlink>
+      <w:r>
+        <w:rPr>
+          <w:rFonts w:ascii="Arial" w:hAnsi="Arial"/>
           <w:color w:val="5B677A"/>
           <w:sz w:val="17"/>
-          <w:lang w:val="es-AR"/>
-        </w:rPr>
-        <w:t>Portfolio</w:t>
-      </w:r>
-      <w:proofErr w:type="gramEnd"/>
+        </w:rPr>
+        <w:t xml:space="preserve"> | </w:t>
+      </w:r>
+      <w:hyperlink r:id="rId11">
+        <w:r>
+          <w:rPr>
+            <w:rStyle w:val="Hyperlink"/>
+            <w:color w:val="2563EB"/>
+            <w:u w:val="single"/>
+            <w:rFonts w:ascii="Arial" w:hAnsi="Arial"/>
+            <w:sz w:val="17"/>
+            <w:szCs w:val="17"/>
+          </w:rPr>
+          <w:t>Portfolio</w:t>
+        </w:r>
+      </w:hyperlink>
     </w:p>
     <w:p>
       <w:pPr>

</xml_diff>

<commit_message>
se cambio lo de fistify
</commit_message>
<xml_diff>
--- a/output/docx/Ramiro_Godino_CV_Data_Engineer.docx
+++ b/output/docx/Ramiro_Godino_CV_Data_Engineer.docx
@@ -727,7 +727,7 @@
                 <w:color w:val="111827"/>
                 <w:sz w:val="16"/>
               </w:rPr>
-              <w:t>React, Node.js, Firebase, Git, GitHub, ClickUp, VS Code</w:t>
+              <w:t>React, Node.js, Fastify 5, Git, GitHub, ClickUp, VS Code</w:t>
             </w:r>
           </w:p>
         </w:tc>
@@ -1175,7 +1175,7 @@
           <w:color w:val="111827"/>
           <w:lang w:val="es-AR"/>
         </w:rPr>
-        <w:t>Firebase</w:t>
+        <w:t>Fastify 5</w:t>
       </w:r>
       <w:proofErr w:type="spellEnd"/>
       <w:r>

</xml_diff>

<commit_message>
agregamos skills para el cv
</commit_message>
<xml_diff>
--- a/output/docx/Ramiro_Godino_CV_Data_Engineer.docx
+++ b/output/docx/Ramiro_Godino_CV_Data_Engineer.docx
@@ -47,7 +47,7 @@
           <w:color w:val="111827"/>
           <w:sz w:val="20"/>
         </w:rPr>
-        <w:t>Data Engineer | SQL - Python - ETL - Pipelines - Spark - Hadoop - BI</w:t>
+        <w:t>Data Engineer | SQL - Python - ETL - Pipelines - Spark - Hadoop - Databricks - Airflow - dbt - BI</w:t>
       </w:r>
     </w:p>
     <w:p>
@@ -328,7 +328,7 @@
           <w:color w:val="111827"/>
           <w:lang w:val="es-AR"/>
         </w:rPr>
-        <w:t>a de datos, procesamiento, almacenamiento, BI y modelos predictivos.</w:t>
+        <w:t>a de datos, procesamiento, almacenamiento, Data Warehouse, Databricks, Delta Lake, Lakehouse, Airflow, dbt, Azure, BI y modelos predictivos.</w:t>
       </w:r>
     </w:p>
     <w:p>
@@ -997,7 +997,7 @@
           <w:color w:val="111827"/>
           <w:lang w:val="es-AR"/>
         </w:rPr>
-        <w:t>, procesamiento y disponibilidad de datos municipales.</w:t>
+        <w:t>, modelado de datos, procesamiento y disponibilidad de datos municipales.</w:t>
       </w:r>
     </w:p>
     <w:p>
@@ -1213,7 +1213,7 @@
           <w:color w:val="111827"/>
           <w:sz w:val="17"/>
         </w:rPr>
-        <w:t xml:space="preserve">SQL, Informix, Python, Pandas, PySpark, Spark, Hadoop, cron, Power BI, Excel, React, Node.js, Git, </w:t>
+        <w:t xml:space="preserve">SQL, Informix, Python, Pandas, PySpark, Spark, Hadoop, Databricks, Delta Lake, Airflow, dbt, Azure, cron, Power BI, Excel, React, Node.js, Git, </w:t>
       </w:r>
       <w:proofErr w:type="spellStart"/>
       <w:r>

</xml_diff>

<commit_message>
agregamos skills para el cv y arreglado
</commit_message>
<xml_diff>
--- a/output/docx/Ramiro_Godino_CV_Data_Engineer.docx
+++ b/output/docx/Ramiro_Godino_CV_Data_Engineer.docx
@@ -43,11 +43,7 @@
         <w:jc w:val="center"/>
       </w:pPr>
       <w:r>
-        <w:rPr>
-          <w:color w:val="111827"/>
-          <w:sz w:val="20"/>
-        </w:rPr>
-        <w:t>Data Engineer | SQL - Python - ETL - Pipelines - Spark - Hadoop - Databricks - Airflow - dbt - BI</w:t>
+        <w:t>Data Engineer | SQL - Python - ETL - Pipelines - Spark - Hadoop - BI</w:t>
       </w:r>
     </w:p>
     <w:p>
@@ -60,88 +56,46 @@
           <w:lang w:val="es-AR"/>
         </w:rPr>
       </w:pPr>
-      <w:proofErr w:type="gramStart"/>
-      <w:proofErr w:type="gramEnd"/>
       <w:r>
-        <w:rPr>
-          <w:rFonts w:ascii="Arial" w:hAnsi="Arial"/>
-          <w:color w:val="5B677A"/>
-          <w:sz w:val="17"/>
-        </w:rPr>
-        <w:t xml:space="preserve">Vicente L?pez, Buenos Aires, Argentina | </w:t>
+        <w:t xml:space="preserve">Vicente López, Buenos Aires, Argentina | </w:t>
       </w:r>
       <w:hyperlink r:id="rId8">
         <w:r>
           <w:rPr>
             <w:rStyle w:val="Hyperlink"/>
-            <w:color w:val="2563EB"/>
-            <w:u w:val="single"/>
-            <w:rFonts w:ascii="Arial" w:hAnsi="Arial"/>
-            <w:sz w:val="17"/>
-            <w:szCs w:val="17"/>
           </w:rPr>
           <w:t>ramisoaresgache@hotmail.com</w:t>
         </w:r>
       </w:hyperlink>
       <w:r>
-        <w:rPr>
-          <w:rFonts w:ascii="Arial" w:hAnsi="Arial"/>
-          <w:color w:val="5B677A"/>
-          <w:sz w:val="17"/>
-        </w:rPr>
         <w:t xml:space="preserve"> | </w:t>
       </w:r>
       <w:hyperlink r:id="rId9">
         <w:r>
           <w:rPr>
             <w:rStyle w:val="Hyperlink"/>
-            <w:color w:val="2563EB"/>
-            <w:u w:val="single"/>
-            <w:rFonts w:ascii="Arial" w:hAnsi="Arial"/>
-            <w:sz w:val="17"/>
-            <w:szCs w:val="17"/>
           </w:rPr>
           <w:t>LinkedIn</w:t>
         </w:r>
       </w:hyperlink>
       <w:r>
-        <w:rPr>
-          <w:rFonts w:ascii="Arial" w:hAnsi="Arial"/>
-          <w:color w:val="5B677A"/>
-          <w:sz w:val="17"/>
-        </w:rPr>
         <w:t xml:space="preserve"> | </w:t>
       </w:r>
       <w:hyperlink r:id="rId10">
         <w:r>
           <w:rPr>
             <w:rStyle w:val="Hyperlink"/>
-            <w:color w:val="2563EB"/>
-            <w:u w:val="single"/>
-            <w:rFonts w:ascii="Arial" w:hAnsi="Arial"/>
-            <w:sz w:val="17"/>
-            <w:szCs w:val="17"/>
           </w:rPr>
           <w:t>GitHub</w:t>
         </w:r>
       </w:hyperlink>
       <w:r>
-        <w:rPr>
-          <w:rFonts w:ascii="Arial" w:hAnsi="Arial"/>
-          <w:color w:val="5B677A"/>
-          <w:sz w:val="17"/>
-        </w:rPr>
         <w:t xml:space="preserve"> | </w:t>
       </w:r>
-      <w:hyperlink r:id="rId11">
+      <w:hyperlink r:id="rId12">
         <w:r>
           <w:rPr>
             <w:rStyle w:val="Hyperlink"/>
-            <w:color w:val="2563EB"/>
-            <w:u w:val="single"/>
-            <w:rFonts w:ascii="Arial" w:hAnsi="Arial"/>
-            <w:sz w:val="17"/>
-            <w:szCs w:val="17"/>
           </w:rPr>
           <w:t>Portfolio</w:t>
         </w:r>
@@ -184,151 +138,7 @@
         </w:rPr>
       </w:pPr>
       <w:r>
-        <w:rPr>
-          <w:color w:val="111827"/>
-          <w:lang w:val="es-AR"/>
-        </w:rPr>
-        <w:t>Data Engineer con base en an</w:t>
-      </w:r>
-      <w:r>
-        <w:rPr>
-          <w:color w:val="111827"/>
-          <w:lang w:val="es-AR"/>
-        </w:rPr>
-        <w:t>á</w:t>
-      </w:r>
-      <w:r>
-        <w:rPr>
-          <w:color w:val="111827"/>
-          <w:lang w:val="es-AR"/>
-        </w:rPr>
-        <w:t>lisis funcional y experiencia en gobierno local, explotaci</w:t>
-      </w:r>
-      <w:r>
-        <w:rPr>
-          <w:color w:val="111827"/>
-          <w:lang w:val="es-AR"/>
-        </w:rPr>
-        <w:t>ó</w:t>
-      </w:r>
-      <w:r>
-        <w:rPr>
-          <w:color w:val="111827"/>
-          <w:lang w:val="es-AR"/>
-        </w:rPr>
-        <w:t>n de bases relacionales, dise</w:t>
-      </w:r>
-      <w:r>
-        <w:rPr>
-          <w:color w:val="111827"/>
-          <w:lang w:val="es-AR"/>
-        </w:rPr>
-        <w:t>ñ</w:t>
-      </w:r>
-      <w:r>
-        <w:rPr>
-          <w:color w:val="111827"/>
-          <w:lang w:val="es-AR"/>
-        </w:rPr>
-        <w:t>o de procesos ETL, automatizaci</w:t>
-      </w:r>
-      <w:r>
-        <w:rPr>
-          <w:color w:val="111827"/>
-          <w:lang w:val="es-AR"/>
-        </w:rPr>
-        <w:t>ó</w:t>
-      </w:r>
-      <w:r>
-        <w:rPr>
-          <w:color w:val="111827"/>
-          <w:lang w:val="es-AR"/>
-        </w:rPr>
-        <w:t>n de reportes y desarrollo de soluciones internas para la toma de decisiones. Trabajo sobre SIGIP, sistema integral de gesti</w:t>
-      </w:r>
-      <w:r>
-        <w:rPr>
-          <w:color w:val="111827"/>
-          <w:lang w:val="es-AR"/>
-        </w:rPr>
-        <w:t>ó</w:t>
-      </w:r>
-      <w:r>
-        <w:rPr>
-          <w:color w:val="111827"/>
-          <w:lang w:val="es-AR"/>
-        </w:rPr>
-        <w:t>n de ingresos p</w:t>
-      </w:r>
-      <w:r>
-        <w:rPr>
-          <w:color w:val="111827"/>
-          <w:lang w:val="es-AR"/>
-        </w:rPr>
-        <w:t>ú</w:t>
-      </w:r>
-      <w:r>
-        <w:rPr>
-          <w:color w:val="111827"/>
-          <w:lang w:val="es-AR"/>
-        </w:rPr>
-        <w:t>blicos, participando en m</w:t>
-      </w:r>
-      <w:r>
-        <w:rPr>
-          <w:color w:val="111827"/>
-          <w:lang w:val="es-AR"/>
-        </w:rPr>
-        <w:t>ó</w:t>
-      </w:r>
-      <w:r>
-        <w:rPr>
-          <w:color w:val="111827"/>
-          <w:lang w:val="es-AR"/>
-        </w:rPr>
-        <w:t>dulos vinculados a recaudaci</w:t>
-      </w:r>
-      <w:r>
-        <w:rPr>
-          <w:color w:val="111827"/>
-          <w:lang w:val="es-AR"/>
-        </w:rPr>
-        <w:t>ó</w:t>
-      </w:r>
-      <w:r>
-        <w:rPr>
-          <w:color w:val="111827"/>
-          <w:lang w:val="es-AR"/>
-        </w:rPr>
-        <w:t>n, tasas, deuda, inspecciones, cobrabilidad, estad</w:t>
-      </w:r>
-      <w:r>
-        <w:rPr>
-          <w:color w:val="111827"/>
-          <w:lang w:val="es-AR"/>
-        </w:rPr>
-        <w:t>í</w:t>
-      </w:r>
-      <w:r>
-        <w:rPr>
-          <w:color w:val="111827"/>
-          <w:lang w:val="es-AR"/>
-        </w:rPr>
-        <w:t>sticas y proyecciones. Actualmente curso Ciencia de Datos e IA, con foco en ingenier</w:t>
-      </w:r>
-      <w:r>
-        <w:rPr>
-          <w:color w:val="111827"/>
-          <w:lang w:val="es-AR"/>
-        </w:rPr>
-        <w:t>í</w:t>
-      </w:r>
-      <w:r>
-        <w:rPr>
-          <w:color w:val="111827"/>
-          <w:lang w:val="es-AR"/>
-        </w:rPr>
-        <w:t>a de datos, procesamiento, almacenamiento, Data Warehouse, Databricks, Delta Lake, Lakehouse, Airflow, dbt, Azure, BI y modelos predictivos.</w:t>
+        <w:t>Data Engineer con base en análisis funcional y experiencia en gobierno local, explotación de bases relacionales, diseño de procesos ETL, automatización de reportes y desarrollo de soluciones internas para la toma de decisiones. Trabajo sobre SIGIP, sistema integral de gestión de ingresos públicos, participando en módulos vinculados a recaudación, tasas, deuda, inspecciones, cobrabilidad, estadísticas y proyecciones. Actualmente curso Ciencia de Datos e IA, con foco en ingeniería de datos, procesamiento, almacenamiento, BI y modelos predictivos.</w:t>
       </w:r>
     </w:p>
     <w:p>
@@ -496,62 +306,7 @@
               </w:rPr>
             </w:pPr>
             <w:r>
-              <w:rPr>
-                <w:color w:val="111827"/>
-                <w:sz w:val="16"/>
-                <w:lang w:val="es-AR"/>
-              </w:rPr>
-              <w:t>ETL, pipelines de datos, procesamiento, almacenamiento, validaci</w:t>
-            </w:r>
-            <w:r>
-              <w:rPr>
-                <w:color w:val="111827"/>
-                <w:sz w:val="16"/>
-                <w:lang w:val="es-AR"/>
-              </w:rPr>
-              <w:t>ó</w:t>
-            </w:r>
-            <w:r>
-              <w:rPr>
-                <w:color w:val="111827"/>
-                <w:sz w:val="16"/>
-                <w:lang w:val="es-AR"/>
-              </w:rPr>
-              <w:t>n, automatizaci</w:t>
-            </w:r>
-            <w:r>
-              <w:rPr>
-                <w:color w:val="111827"/>
-                <w:sz w:val="16"/>
-                <w:lang w:val="es-AR"/>
-              </w:rPr>
-              <w:t>ó</w:t>
-            </w:r>
-            <w:r>
-              <w:rPr>
-                <w:color w:val="111827"/>
-                <w:sz w:val="16"/>
-                <w:lang w:val="es-AR"/>
-              </w:rPr>
-              <w:t xml:space="preserve">n, </w:t>
-            </w:r>
-            <w:proofErr w:type="spellStart"/>
-            <w:r>
-              <w:rPr>
-                <w:color w:val="111827"/>
-                <w:sz w:val="16"/>
-                <w:lang w:val="es-AR"/>
-              </w:rPr>
-              <w:t>APIs</w:t>
-            </w:r>
-            <w:proofErr w:type="spellEnd"/>
-            <w:r>
-              <w:rPr>
-                <w:color w:val="111827"/>
-                <w:sz w:val="16"/>
-                <w:lang w:val="es-AR"/>
-              </w:rPr>
-              <w:t xml:space="preserve"> REST, cron</w:t>
+              <w:t>ETL/ELT, pipelines de datos, procesamiento, almacenamiento, validación, automatización, APIs REST, cron, Airflow, dbt, Data Warehouse, modelado de datos</w:t>
             </w:r>
           </w:p>
         </w:tc>
@@ -602,28 +357,7 @@
               </w:rPr>
             </w:pPr>
             <w:r>
-              <w:rPr>
-                <w:color w:val="111827"/>
-                <w:sz w:val="16"/>
-                <w:lang w:val="es-AR"/>
-              </w:rPr>
-              <w:t>Informix, SQL Server, PostgreSQL, Spark, Hadoop, modelado relacional y consultas sobre grandes vol</w:t>
-            </w:r>
-            <w:r>
-              <w:rPr>
-                <w:color w:val="111827"/>
-                <w:sz w:val="16"/>
-                <w:lang w:val="es-AR"/>
-              </w:rPr>
-              <w:t>ú</w:t>
-            </w:r>
-            <w:r>
-              <w:rPr>
-                <w:color w:val="111827"/>
-                <w:sz w:val="16"/>
-                <w:lang w:val="es-AR"/>
-              </w:rPr>
-              <w:t>menes</w:t>
+              <w:t>Informix, SQL Server, PostgreSQL, Spark, Hadoop, Databricks, Delta Lake, Lakehouse, modelado relacional y consultas sobre grandes volúmenes</w:t>
             </w:r>
           </w:p>
         </w:tc>
@@ -723,11 +457,7 @@
               <w:spacing w:after="0" w:line="240" w:lineRule="auto"/>
             </w:pPr>
             <w:r>
-              <w:rPr>
-                <w:color w:val="111827"/>
-                <w:sz w:val="16"/>
-              </w:rPr>
-              <w:t>React, Node.js, Fastify 5, Git, GitHub, ClickUp, VS Code</w:t>
+              <w:t>React, Node.js, Fastify 5, Git, GitHub, Azure, ClickUp, VS Code</w:t>
             </w:r>
           </w:p>
         </w:tc>
@@ -944,60 +674,7 @@
         </w:rPr>
       </w:pPr>
       <w:r>
-        <w:rPr>
-          <w:color w:val="111827"/>
-          <w:lang w:val="es-AR"/>
-        </w:rPr>
-        <w:t>Diseño</w:t>
-      </w:r>
-      <w:r>
-        <w:rPr>
-          <w:color w:val="111827"/>
-          <w:lang w:val="es-AR"/>
-        </w:rPr>
-        <w:t xml:space="preserve"> procesos ETL, pipelines y automatizaciones con SQL, Informix, Python y cron para </w:t>
-      </w:r>
-      <w:r>
-        <w:rPr>
-          <w:color w:val="111827"/>
-          <w:lang w:val="es-AR"/>
-        </w:rPr>
-        <w:t>extracción</w:t>
-      </w:r>
-      <w:r>
-        <w:rPr>
-          <w:color w:val="111827"/>
-          <w:lang w:val="es-AR"/>
-        </w:rPr>
-        <w:t xml:space="preserve">, </w:t>
-      </w:r>
-      <w:r>
-        <w:rPr>
-          <w:color w:val="111827"/>
-          <w:lang w:val="es-AR"/>
-        </w:rPr>
-        <w:t>transformación</w:t>
-      </w:r>
-      <w:r>
-        <w:rPr>
-          <w:color w:val="111827"/>
-          <w:lang w:val="es-AR"/>
-        </w:rPr>
-        <w:t xml:space="preserve">, </w:t>
-      </w:r>
-      <w:r>
-        <w:rPr>
-          <w:color w:val="111827"/>
-          <w:lang w:val="es-AR"/>
-        </w:rPr>
-        <w:t>validación</w:t>
-      </w:r>
-      <w:r>
-        <w:rPr>
-          <w:color w:val="111827"/>
-          <w:lang w:val="es-AR"/>
-        </w:rPr>
-        <w:t>, modelado de datos, procesamiento y disponibilidad de datos municipales.</w:t>
+        <w:t>Diseño procesos ETL, pipelines y automatizaciones con SQL, Informix, Python y cron para extracción, transformación, validación, procesamiento y disponibilidad de datos municipales.</w:t>
       </w:r>
     </w:p>
     <w:p>
@@ -1190,46 +867,8 @@
       <w:pPr>
         <w:spacing w:after="40" w:line="240" w:lineRule="auto"/>
       </w:pPr>
-      <w:proofErr w:type="spellStart"/>
       <w:r>
-        <w:rPr>
-          <w:b/>
-          <w:color w:val="111827"/>
-          <w:sz w:val="17"/>
-        </w:rPr>
-        <w:t>Herramientas</w:t>
-      </w:r>
-      <w:proofErr w:type="spellEnd"/>
-      <w:r>
-        <w:rPr>
-          <w:b/>
-          <w:color w:val="111827"/>
-          <w:sz w:val="17"/>
-        </w:rPr>
-        <w:t xml:space="preserve">: </w:t>
-      </w:r>
-      <w:r>
-        <w:rPr>
-          <w:color w:val="111827"/>
-          <w:sz w:val="17"/>
-        </w:rPr>
-        <w:t xml:space="preserve">SQL, Informix, Python, Pandas, PySpark, Spark, Hadoop, Databricks, Delta Lake, Airflow, dbt, Azure, cron, Power BI, Excel, React, Node.js, Git, </w:t>
-      </w:r>
-      <w:proofErr w:type="spellStart"/>
-      <w:r>
-        <w:rPr>
-          <w:color w:val="111827"/>
-          <w:sz w:val="17"/>
-        </w:rPr>
-        <w:t>ClickUp</w:t>
-      </w:r>
-      <w:proofErr w:type="spellEnd"/>
-      <w:r>
-        <w:rPr>
-          <w:color w:val="111827"/>
-          <w:sz w:val="17"/>
-        </w:rPr>
-        <w:t>.</w:t>
+        <w:t>Herramientas: SQL, Informix, Python, Pandas, PySpark, Spark, Hadoop, cron, Power BI, Excel, React, Node.js, Fastify 5, Git, ClickUp.</w:t>
       </w:r>
     </w:p>
     <w:p>
@@ -1289,56 +928,8 @@
           <w:lang w:val="es-AR"/>
         </w:rPr>
       </w:pPr>
-      <w:proofErr w:type="gramStart"/>
       <w:r>
-        <w:rPr>
-          <w:color w:val="111827"/>
-          <w:lang w:val="es-AR"/>
-        </w:rPr>
-        <w:t>Relev</w:t>
-      </w:r>
-      <w:r>
-        <w:rPr>
-          <w:color w:val="111827"/>
-          <w:lang w:val="es-AR"/>
-        </w:rPr>
-        <w:t>e</w:t>
-      </w:r>
-      <w:proofErr w:type="gramEnd"/>
-      <w:r>
-        <w:rPr>
-          <w:color w:val="111827"/>
-          <w:lang w:val="es-AR"/>
-        </w:rPr>
-        <w:t xml:space="preserve"> necesidades de usuarios internos y traduje requerimientos funcionales en mejoras, reportes, </w:t>
-      </w:r>
-      <w:r>
-        <w:rPr>
-          <w:color w:val="111827"/>
-          <w:lang w:val="es-AR"/>
-        </w:rPr>
-        <w:t>documentación</w:t>
-      </w:r>
-      <w:r>
-        <w:rPr>
-          <w:color w:val="111827"/>
-          <w:lang w:val="es-AR"/>
-        </w:rPr>
-        <w:t xml:space="preserve"> y funcionalidades para sistemas de </w:t>
-      </w:r>
-      <w:r>
-        <w:rPr>
-          <w:color w:val="111827"/>
-          <w:lang w:val="es-AR"/>
-        </w:rPr>
-        <w:t>gestión</w:t>
-      </w:r>
-      <w:r>
-        <w:rPr>
-          <w:color w:val="111827"/>
-          <w:lang w:val="es-AR"/>
-        </w:rPr>
-        <w:t xml:space="preserve"> municipal.</w:t>
+        <w:t>Relevé necesidades de usuarios internos y traduje requerimientos funcionales en mejoras, reportes, documentación y funcionalidades para sistemas de gestión municipal.</w:t>
       </w:r>
     </w:p>
     <w:p>
@@ -1351,104 +942,7 @@
         </w:rPr>
       </w:pPr>
       <w:r>
-        <w:rPr>
-          <w:color w:val="111827"/>
-          <w:lang w:val="es-AR"/>
-        </w:rPr>
-        <w:t>Participe</w:t>
-      </w:r>
-      <w:r>
-        <w:rPr>
-          <w:color w:val="111827"/>
-          <w:lang w:val="es-AR"/>
-        </w:rPr>
-        <w:t xml:space="preserve"> en el </w:t>
-      </w:r>
-      <w:r>
-        <w:rPr>
-          <w:color w:val="111827"/>
-          <w:lang w:val="es-AR"/>
-        </w:rPr>
-        <w:t>análisis</w:t>
-      </w:r>
-      <w:r>
-        <w:rPr>
-          <w:color w:val="111827"/>
-          <w:lang w:val="es-AR"/>
-        </w:rPr>
-        <w:t xml:space="preserve">, </w:t>
-      </w:r>
-      <w:r>
-        <w:rPr>
-          <w:color w:val="111827"/>
-          <w:lang w:val="es-AR"/>
-        </w:rPr>
-        <w:t>documentación</w:t>
-      </w:r>
-      <w:r>
-        <w:rPr>
-          <w:color w:val="111827"/>
-          <w:lang w:val="es-AR"/>
-        </w:rPr>
-        <w:t xml:space="preserve"> y </w:t>
-      </w:r>
-      <w:proofErr w:type="spellStart"/>
-      <w:r>
-        <w:rPr>
-          <w:color w:val="111827"/>
-          <w:lang w:val="es-AR"/>
-        </w:rPr>
-        <w:t>testing</w:t>
-      </w:r>
-      <w:proofErr w:type="spellEnd"/>
-      <w:r>
-        <w:rPr>
-          <w:color w:val="111827"/>
-          <w:lang w:val="es-AR"/>
-        </w:rPr>
-        <w:t xml:space="preserve"> de procesos vinculados a </w:t>
-      </w:r>
-      <w:r>
-        <w:rPr>
-          <w:color w:val="111827"/>
-          <w:lang w:val="es-AR"/>
-        </w:rPr>
-        <w:t>módulos</w:t>
-      </w:r>
-      <w:r>
-        <w:rPr>
-          <w:color w:val="111827"/>
-          <w:lang w:val="es-AR"/>
-        </w:rPr>
-        <w:t xml:space="preserve"> tributarios y de </w:t>
-      </w:r>
-      <w:r>
-        <w:rPr>
-          <w:color w:val="111827"/>
-          <w:lang w:val="es-AR"/>
-        </w:rPr>
-        <w:t>gestión</w:t>
-      </w:r>
-      <w:r>
-        <w:rPr>
-          <w:color w:val="111827"/>
-          <w:lang w:val="es-AR"/>
-        </w:rPr>
-        <w:t xml:space="preserve"> de ingresos </w:t>
-      </w:r>
-      <w:r>
-        <w:rPr>
-          <w:color w:val="111827"/>
-          <w:lang w:val="es-AR"/>
-        </w:rPr>
-        <w:t>públicos</w:t>
-      </w:r>
-      <w:r>
-        <w:rPr>
-          <w:color w:val="111827"/>
-          <w:lang w:val="es-AR"/>
-        </w:rPr>
-        <w:t>.</w:t>
+        <w:t>Participé en el análisis, documentación y testing de procesos vinculados a módulos tributarios y de gestión de ingresos públicos.</w:t>
       </w:r>
     </w:p>
     <w:p>
@@ -1461,53 +955,7 @@
         </w:rPr>
       </w:pPr>
       <w:r>
-        <w:rPr>
-          <w:color w:val="111827"/>
-          <w:lang w:val="es-AR"/>
-        </w:rPr>
-        <w:t>Coordin</w:t>
-      </w:r>
-      <w:r>
-        <w:rPr>
-          <w:color w:val="111827"/>
-          <w:lang w:val="es-AR"/>
-        </w:rPr>
-        <w:t>e</w:t>
-      </w:r>
-      <w:r>
-        <w:rPr>
-          <w:color w:val="111827"/>
-          <w:lang w:val="es-AR"/>
-        </w:rPr>
-        <w:t xml:space="preserve"> tareas, incidencias y prioridades con </w:t>
-      </w:r>
-      <w:r>
-        <w:rPr>
-          <w:color w:val="111827"/>
-          <w:lang w:val="es-AR"/>
-        </w:rPr>
-        <w:t>á</w:t>
-      </w:r>
-      <w:r>
-        <w:rPr>
-          <w:color w:val="111827"/>
-          <w:lang w:val="es-AR"/>
-        </w:rPr>
-        <w:t xml:space="preserve">reas usuarias, colaborando en la mejora continua de procesos y en la </w:t>
-      </w:r>
-      <w:r>
-        <w:rPr>
-          <w:color w:val="111827"/>
-          <w:lang w:val="es-AR"/>
-        </w:rPr>
-        <w:t>evolución</w:t>
-      </w:r>
-      <w:r>
-        <w:rPr>
-          <w:color w:val="111827"/>
-          <w:lang w:val="es-AR"/>
-        </w:rPr>
-        <w:t xml:space="preserve"> de sistemas internos.</w:t>
+        <w:t>Coordiné tareas, incidencias y prioridades con áreas usuarias, colaborando en la mejora continua de procesos y en la evolución de sistemas internos.</w:t>
       </w:r>
     </w:p>
     <w:p>

</xml_diff>